<commit_message>
fix: ficha da analista terceirizada sai de Encaminhado ao salvar ou finalizar, liberando Encaminhar para Chefia
Processo encaminhado por colega ficava em Encaminhado mesmo com a ficha salva e finalizada, e dali a tramitação não leva a Para conclusão. Salvar ou finalizar a ficha passa por Analisar até Em análise.

Reúne ainda os ajustes pendentes da árvore de trabalho: tramitação e Caixa do setor, parâmetros do Portal, migrations de textos e parâmetros, comando de teste da inscrição imobiliária, HUs e testes.
</commit_message>
<xml_diff>
--- a/docs/requisitos/hus/HU.001 - Autenticar usuario.docx
+++ b/docs/requisitos/hus/HU.001 - Autenticar usuario.docx
@@ -22,7 +22,7 @@
           <w:b/>
           <w:sz w:val="28"/>
         </w:rPr>
-        <w:t xml:space="preserve">HU.001 – AUTENTICAR USUÁRIO</w:t>
+        <w:t>HU.001 – AUTENTICAR USUÁRIO</w:t>
       </w:r>
     </w:p>
     <w:p>
@@ -181,7 +181,6 @@
             <w:pPr>
               <w:jc w:val="center"/>
             </w:pPr>
-            <w:r/>
             <w:r>
               <w:rPr>
                 <w:rFonts w:ascii="Arial" w:hAnsi="Arial"/>
@@ -200,7 +199,6 @@
             <w:pPr>
               <w:jc w:val="left"/>
             </w:pPr>
-            <w:r/>
             <w:r>
               <w:rPr>
                 <w:rFonts w:ascii="Arial" w:hAnsi="Arial"/>
@@ -218,7 +216,6 @@
             <w:pPr>
               <w:jc w:val="center"/>
             </w:pPr>
-            <w:r/>
             <w:r>
               <w:rPr>
                 <w:rFonts w:ascii="Arial" w:hAnsi="Arial"/>
@@ -237,7 +234,6 @@
             <w:pPr>
               <w:jc w:val="center"/>
             </w:pPr>
-            <w:r/>
             <w:r>
               <w:rPr>
                 <w:rFonts w:ascii="Arial" w:hAnsi="Arial"/>
@@ -258,14 +254,13 @@
             <w:pPr>
               <w:jc w:val="center"/>
             </w:pPr>
-            <w:r/>
             <w:r>
               <w:rPr>
                 <w:rFonts w:ascii="Arial" w:hAnsi="Arial"/>
                 <w:b w:val="0"/>
                 <w:sz w:val="20"/>
               </w:rPr>
-              <w:t xml:space="preserve">19/10/2026</w:t>
+              <w:t>19/10/2026</w:t>
             </w:r>
           </w:p>
         </w:tc>
@@ -277,13 +272,12 @@
             <w:pPr>
               <w:jc w:val="left"/>
             </w:pPr>
-            <w:r/>
             <w:r>
               <w:rPr>
                 <w:rFonts w:ascii="Arial" w:hAnsi="Arial"/>
                 <w:sz w:val="20"/>
               </w:rPr>
-              <w:t xml:space="preserve">Retirada das HUs sem funcionalidade no sistema, renumeração e reordenação das demais (retaguarda primeiro, portal depois)</w:t>
+              <w:t>Retirada das HUs sem funcionalidade no sistema, renumeração e reordenação das demais (retaguarda primeiro, portal depois)</w:t>
             </w:r>
           </w:p>
         </w:tc>
@@ -295,14 +289,13 @@
             <w:pPr>
               <w:jc w:val="center"/>
             </w:pPr>
-            <w:r/>
             <w:r>
               <w:rPr>
                 <w:rFonts w:ascii="Arial" w:hAnsi="Arial"/>
                 <w:b w:val="0"/>
                 <w:sz w:val="20"/>
               </w:rPr>
-              <w:t xml:space="preserve">2.2</w:t>
+              <w:t>2.2</w:t>
             </w:r>
           </w:p>
         </w:tc>
@@ -314,14 +307,86 @@
             <w:pPr>
               <w:jc w:val="center"/>
             </w:pPr>
-            <w:r/>
             <w:r>
               <w:rPr>
                 <w:rFonts w:ascii="Arial" w:hAnsi="Arial"/>
                 <w:b w:val="0"/>
                 <w:sz w:val="20"/>
               </w:rPr>
-              <w:t xml:space="preserve">Sudoeste Informática</w:t>
+              <w:t>Sudoeste Informática</w:t>
+            </w:r>
+          </w:p>
+        </w:tc>
+      </w:tr>
+      <w:tr>
+        <w:tc>
+          <w:tcPr>
+            <w:tcW w:type="dxa" w:w="2412"/>
+          </w:tcPr>
+          <w:p>
+            <w:pPr>
+              <w:jc w:val="center"/>
+            </w:pPr>
+            <w:r>
+              <w:rPr>
+                <w:rFonts w:ascii="Arial" w:hAnsi="Arial"/>
+                <w:b w:val="0"/>
+                <w:sz w:val="20"/>
+              </w:rPr>
+              <w:t>22/10/2026</w:t>
+            </w:r>
+          </w:p>
+        </w:tc>
+        <w:tc>
+          <w:tcPr>
+            <w:tcW w:type="dxa" w:w="2412"/>
+          </w:tcPr>
+          <w:p>
+            <w:pPr>
+              <w:jc w:val="left"/>
+            </w:pPr>
+            <w:r>
+              <w:rPr>
+                <w:rFonts w:ascii="Arial" w:hAnsi="Arial"/>
+                <w:sz w:val="20"/>
+              </w:rPr>
+              <w:t>Portal sem login próprio: o cidadão entra pelo Portal de Serviços da SEDUR (HU-142); esta HU passa a tratar só a entrada do console</w:t>
+            </w:r>
+          </w:p>
+        </w:tc>
+        <w:tc>
+          <w:tcPr>
+            <w:tcW w:type="dxa" w:w="2412"/>
+          </w:tcPr>
+          <w:p>
+            <w:pPr>
+              <w:jc w:val="center"/>
+            </w:pPr>
+            <w:r>
+              <w:rPr>
+                <w:rFonts w:ascii="Arial" w:hAnsi="Arial"/>
+                <w:b w:val="0"/>
+                <w:sz w:val="20"/>
+              </w:rPr>
+              <w:t>2.3</w:t>
+            </w:r>
+          </w:p>
+        </w:tc>
+        <w:tc>
+          <w:tcPr>
+            <w:tcW w:type="dxa" w:w="2412"/>
+          </w:tcPr>
+          <w:p>
+            <w:pPr>
+              <w:jc w:val="center"/>
+            </w:pPr>
+            <w:r>
+              <w:rPr>
+                <w:rFonts w:ascii="Arial" w:hAnsi="Arial"/>
+                <w:b w:val="0"/>
+                <w:sz w:val="20"/>
+              </w:rPr>
+              <w:t>Sudoeste Informática</w:t>
             </w:r>
           </w:p>
         </w:tc>
@@ -354,7 +419,19 @@
           <w:rFonts w:ascii="Arial" w:hAnsi="Arial"/>
           <w:sz w:val="24"/>
         </w:rPr>
-        <w:t>O cidadão entra no portal com CPF e senha da própria conta. O servidor entra no console com e-mail ou usuário da rede da SEDUR e senha. As duas entradas são independentes: sair do console não encerra a sessão do portal, e o portal nunca abre uma tela do console. Conta da rede da SEDUR só vale a senha conferida na rede institucional. A senha local da conta não é usada nesse caso, e a senha digitada no primeiro acesso não fica guardada como senha do Viabiliza. Se a entrada pela rede estiver desligada, a conta da rede é recusada. Não há segundo fator nem acesso pela rede da SEDUR no portal. Este fluxo não consulta mapa, REDESIM, CNAE nem a LOUOS.</w:t>
+        <w:t>O servidor entra no console com e-mail ou usuário da rede da SEDUR e senha. O cidadão não entra por esta tela: a entrada dele no portal do Viabiliza é sempre pelo Portal de Serviços da SEDUR, na HU-142, e o portal não tem tela de login com CPF e senha. As duas entradas são independentes: sair do console não encerra a sessão do portal, e o portal nunca abre uma tela do console.</w:t>
+      </w:r>
+    </w:p>
+    <w:p>
+      <w:pPr>
+        <w:jc w:val="both"/>
+      </w:pPr>
+      <w:r>
+        <w:rPr>
+          <w:rFonts w:ascii="Arial" w:hAnsi="Arial"/>
+          <w:sz w:val="24"/>
+        </w:rPr>
+        <w:t>Conta da rede da SEDUR só vale a senha conferida na rede institucional. A senha local da conta não é usada nesse caso, e a senha digitada no primeiro acesso não fica guardada como senha do Viabiliza. Se a entrada pela rede estiver desligada, a conta da rede é recusada. Não há segundo fator. Este fluxo não consulta mapa, REDESIM, CNAE nem a LOUOS.</w:t>
       </w:r>
     </w:p>
     <w:p/>
@@ -423,7 +500,7 @@
           <w:rFonts w:ascii="Arial" w:hAnsi="Arial"/>
           <w:sz w:val="22"/>
         </w:rPr>
-        <w:t xml:space="preserve">  TELA 1 - Entrar no Viabiliza</w:t>
+        <w:t xml:space="preserve">  TELA 1 - Entrar no console</w:t>
       </w:r>
     </w:p>
     <w:p>
@@ -482,7 +559,7 @@
           <w:b w:val="0"/>
           <w:sz w:val="24"/>
         </w:rPr>
-        <w:t>separar a entrada do cidadão e a do servidor</w:t>
+        <w:t>separar a entrada do servidor da entrada do cidadão</w:t>
       </w:r>
       <w:r>
         <w:rPr>
@@ -527,7 +604,7 @@
           <w:b w:val="0"/>
           <w:sz w:val="24"/>
         </w:rPr>
-        <w:t>usuário com conta no Viabiliza</w:t>
+        <w:t>servidor com conta no Viabiliza</w:t>
       </w:r>
       <w:r>
         <w:rPr>
@@ -543,7 +620,7 @@
           <w:b w:val="0"/>
           <w:sz w:val="24"/>
         </w:rPr>
-        <w:t>entrar no portal ou no console com a credencial do meu ambiente</w:t>
+        <w:t>entrar no console com a credencial do meu ambiente</w:t>
       </w:r>
       <w:r>
         <w:rPr>
@@ -579,7 +656,7 @@
           <w:rFonts w:ascii="Arial" w:hAnsi="Arial"/>
           <w:sz w:val="24"/>
         </w:rPr>
-        <w:t>• Portal: CPF e senha local; a pessoa ainda não está no portal</w:t>
+        <w:t>• Identificador (e-mail ou usuário da rede da SEDUR) e senha, com até 255 caracteres no identificador</w:t>
       </w:r>
     </w:p>
     <w:p>
@@ -591,7 +668,7 @@
           <w:rFonts w:ascii="Arial" w:hAnsi="Arial"/>
           <w:sz w:val="24"/>
         </w:rPr>
-        <w:t>• Console: identificador (e-mail ou usuário da rede da SEDUR) e senha, com até 255 caracteres no identificador</w:t>
+        <w:t>• Conta ativa, e-mail confirmado e permissão de uso do console</w:t>
       </w:r>
     </w:p>
     <w:p>
@@ -603,7 +680,7 @@
           <w:rFonts w:ascii="Arial" w:hAnsi="Arial"/>
           <w:sz w:val="24"/>
         </w:rPr>
-        <w:t>• Conta ativa, e-mail confirmado no console, e permissão de uso do console quando a entrada for de servidor</w:t>
+        <w:t>• Depois da entrada, o termo de proteção de dados vigente precisa estar aceito para seguir no console</w:t>
       </w:r>
     </w:p>
     <w:p>
@@ -615,19 +692,7 @@
           <w:rFonts w:ascii="Arial" w:hAnsi="Arial"/>
           <w:sz w:val="24"/>
         </w:rPr>
-        <w:t>• Depois da entrada, o termo de proteção de dados vigente precisa estar aceito para seguir no ambiente</w:t>
-      </w:r>
-    </w:p>
-    <w:p>
-      <w:pPr>
-        <w:jc w:val="both"/>
-      </w:pPr>
-      <w:r>
-        <w:rPr>
-          <w:rFonts w:ascii="Arial" w:hAnsi="Arial"/>
-          <w:sz w:val="24"/>
-        </w:rPr>
-        <w:t>• Tentativas incorretas repetidas bloqueiam temporariamente novas tentativas, por conta e, no console, também por endereço de rede</w:t>
+        <w:t>• Tentativas incorretas repetidas bloqueiam temporariamente novas tentativas, por conta e por endereço de rede</w:t>
       </w:r>
     </w:p>
     <w:p>
@@ -656,7 +721,7 @@
           <w:rFonts w:ascii="Arial" w:hAnsi="Arial"/>
           <w:sz w:val="24"/>
         </w:rPr>
-        <w:t xml:space="preserve">• HU-140 — conta local do cidadão, quando a entrada do portal não for pela rede da SEDUR</w:t>
+        <w:t>• HU-004 — conta local criada pela gestão, quando a entrada não for pela rede da SEDUR</w:t>
       </w:r>
     </w:p>
     <w:p/>
@@ -678,7 +743,7 @@
           <w:rFonts w:ascii="Arial" w:hAnsi="Arial"/>
           <w:sz w:val="24"/>
         </w:rPr>
-        <w:t xml:space="preserve">• HU-141 — e-mail confirmado para concluir a entrada no console e para usar o portal autenticado</w:t>
+        <w:t>• HU-141 — e-mail confirmado para concluir a entrada no console</w:t>
       </w:r>
     </w:p>
     <w:p>
@@ -690,7 +755,7 @@
           <w:rFonts w:ascii="Arial" w:hAnsi="Arial"/>
           <w:sz w:val="24"/>
         </w:rPr>
-        <w:t xml:space="preserve">• HU-145 — aceite do termo vigente depois da entrada</w:t>
+        <w:t>• HU-145 — aceite do termo vigente depois da entrada</w:t>
       </w:r>
     </w:p>
     <w:p>
@@ -706,7 +771,7 @@
         <w:pStyle w:val="Heading2"/>
       </w:pPr>
       <w:r>
-        <w:t>TELA 1 - Entrar no Viabiliza</w:t>
+        <w:t>TELA 1 - Entrar no console</w:t>
       </w:r>
     </w:p>
     <w:p>
@@ -721,7 +786,7 @@
         <w:rPr>
           <w:sz w:val="22"/>
         </w:rPr>
-        <w:t>Tela de entrada do portal e tela de entrada do console, antes do menu</w:t>
+        <w:t>Tela de entrada do console, antes do menu</w:t>
       </w:r>
     </w:p>
     <w:p/>
@@ -780,7 +845,7 @@
           <w:b/>
           <w:sz w:val="22"/>
         </w:rPr>
-        <w:t>Cenário 1: Cidadão entra com CPF</w:t>
+        <w:t>Cenário 1: Cidadão não entra por esta tela</w:t>
       </w:r>
     </w:p>
     <w:p>
@@ -797,7 +862,7 @@
           <w:rFonts w:ascii="Arial" w:hAnsi="Arial"/>
           <w:sz w:val="22"/>
         </w:rPr>
-        <w:t>existe conta ativa com CPF e senha local</w:t>
+        <w:t>a pessoa abre o portal do Viabiliza sem ter entrado</w:t>
       </w:r>
     </w:p>
     <w:p>
@@ -814,7 +879,7 @@
           <w:rFonts w:ascii="Arial" w:hAnsi="Arial"/>
           <w:sz w:val="22"/>
         </w:rPr>
-        <w:t>a pessoa envia a entrada do portal</w:t>
+        <w:t>tenta usar uma tela que exige entrada</w:t>
       </w:r>
     </w:p>
     <w:p>
@@ -831,7 +896,7 @@
           <w:rFonts w:ascii="Arial" w:hAnsi="Arial"/>
           <w:sz w:val="22"/>
         </w:rPr>
-        <w:t>a sessão do portal é aberta, o acesso fica registrado e o destino não é uma tela do console</w:t>
+        <w:t>é levada à entrada do Portal de Serviços da SEDUR, como descrito na HU-142, e não vê tela de CPF e senha do Viabiliza</w:t>
       </w:r>
     </w:p>
     <w:p/>
@@ -1124,7 +1189,7 @@
           <w:rFonts w:ascii="Arial" w:hAnsi="Arial"/>
           <w:sz w:val="22"/>
         </w:rPr>
-        <w:t>a conta está inativa, ou o e-mail do console ainda não foi confirmado</w:t>
+        <w:t>a conta está inativa, ou o e-mail ainda não foi confirmado</w:t>
       </w:r>
     </w:p>
     <w:p>
@@ -1148,6 +1213,8 @@
     <w:sectPr>
       <w:headerReference w:type="default" r:id="rId9"/>
       <w:footerReference w:type="default" r:id="rId10"/>
+      <w:headerReference w:type="first" r:id="rId11"/>
+      <w:headerReference w:type="even" r:id="rId13"/>
       <w:pgSz w:w="12240" w:h="15840"/>
       <w:pgMar w:top="1728" w:right="1296" w:bottom="1296" w:left="1296" w:header="720" w:footer="720" w:gutter="0"/>
       <w:cols w:space="720"/>
@@ -1285,8 +1352,28 @@
         <w:rFonts w:ascii="Arial" w:hAnsi="Arial"/>
         <w:sz w:val="16"/>
       </w:rPr>
-      <w:t xml:space="preserve">HU.001 - AUTENTICAR USUÁRIO - Versão 2.2 – 19/10/2026</w:t>
+      <w:t>HU.001 - AUTENTICAR USUÁRIO - Versão 2.3 – 22/10/2026</w:t>
     </w:r>
+  </w:p>
+</w:hdr>
+</file>
+
+<file path=word/header2.xml><?xml version="1.0" encoding="utf-8"?>
+<w:hdr xmlns:m="http://schemas.openxmlformats.org/officeDocument/2006/math" xmlns:mc="http://schemas.openxmlformats.org/markup-compatibility/2006" xmlns:mo="http://schemas.microsoft.com/office/mac/office/2008/main" xmlns:mv="urn:schemas-microsoft-com:mac:vml" xmlns:o="urn:schemas-microsoft-com:office:office" xmlns:r="http://schemas.openxmlformats.org/officeDocument/2006/relationships" xmlns:v="urn:schemas-microsoft-com:vml" xmlns:w10="urn:schemas-microsoft-com:office:word" xmlns:w14="http://schemas.microsoft.com/office/word/2010/wordml" xmlns:w="http://schemas.openxmlformats.org/wordprocessingml/2006/main" xmlns:wne="http://schemas.microsoft.com/office/word/2006/wordml" xmlns:wp14="http://schemas.microsoft.com/office/word/2010/wordprocessingDrawing" xmlns:wp="http://schemas.openxmlformats.org/drawingml/2006/wordprocessingDrawing" xmlns:wpc="http://schemas.microsoft.com/office/word/2010/wordprocessingCanvas" xmlns:wpg="http://schemas.microsoft.com/office/word/2010/wordprocessingGroup" xmlns:wpi="http://schemas.microsoft.com/office/word/2010/wordprocessingInk" xmlns:wps="http://schemas.microsoft.com/office/word/2010/wordprocessingShape" mc:Ignorable="w14 wp14">
+  <w:p>
+    <w:pPr>
+      <w:pStyle w:val="Header"/>
+    </w:pPr>
+  </w:p>
+</w:hdr>
+</file>
+
+<file path=word/header3.xml><?xml version="1.0" encoding="utf-8"?>
+<w:hdr xmlns:m="http://schemas.openxmlformats.org/officeDocument/2006/math" xmlns:mc="http://schemas.openxmlformats.org/markup-compatibility/2006" xmlns:mo="http://schemas.microsoft.com/office/mac/office/2008/main" xmlns:mv="urn:schemas-microsoft-com:mac:vml" xmlns:o="urn:schemas-microsoft-com:office:office" xmlns:r="http://schemas.openxmlformats.org/officeDocument/2006/relationships" xmlns:v="urn:schemas-microsoft-com:vml" xmlns:w10="urn:schemas-microsoft-com:office:word" xmlns:w14="http://schemas.microsoft.com/office/word/2010/wordml" xmlns:w="http://schemas.openxmlformats.org/wordprocessingml/2006/main" xmlns:wne="http://schemas.microsoft.com/office/word/2006/wordml" xmlns:wp14="http://schemas.microsoft.com/office/word/2010/wordprocessingDrawing" xmlns:wp="http://schemas.openxmlformats.org/drawingml/2006/wordprocessingDrawing" xmlns:wpc="http://schemas.microsoft.com/office/word/2010/wordprocessingCanvas" xmlns:wpg="http://schemas.microsoft.com/office/word/2010/wordprocessingGroup" xmlns:wpi="http://schemas.microsoft.com/office/word/2010/wordprocessingInk" xmlns:wps="http://schemas.microsoft.com/office/word/2010/wordprocessingShape" mc:Ignorable="w14 wp14">
+  <w:p>
+    <w:pPr>
+      <w:pStyle w:val="Header"/>
+    </w:pPr>
   </w:p>
 </w:hdr>
 </file>

</xml_diff>